<commit_message>
Change figure font sizes
</commit_message>
<xml_diff>
--- a/Figures/psem_table.docx
+++ b/Figures/psem_table.docx
@@ -194,15 +194,6 @@
               </w:rPr>
               <w:t xml:space="default">R²m</w:t>
             </w:r>
-            <w:r>
-              <w:rPr>
-                <w:vertAlign w:val="superscript"/>
-                <w:i/>
-                <w:rFonts w:ascii="Calibri" w:hAnsi="Calibri"/>
-                <w:sz w:val="20"/>
-              </w:rPr>
-              <w:t xml:space="default">1</w:t>
-            </w:r>
           </w:p>
         </w:tc>
         <w:tc>
@@ -286,127 +277,127 @@
                 <w:rFonts w:ascii="Calibri" w:hAnsi="Calibri"/>
                 <w:sz w:val="20"/>
               </w:rPr>
-              <w:t xml:space="default">Clim_PC1_s</w:t>
-            </w:r>
-          </w:p>
-        </w:tc>
-        <w:tc>
-          <w:tcPr>
-            <w:tcBorders>
-              <w:top w:val="single" w:space="0" w:color="D3D3D3"/>
-              <w:bottom w:val="single" w:space="0" w:color="D3D3D3"/>
-              <w:start w:val="single" w:space="0" w:color="D3D3D3"/>
-              <w:end w:val="single" w:space="0" w:color="D3D3D3"/>
-            </w:tcBorders>
-          </w:tcPr>
-          <w:p>
-            <w:pPr>
-              <w:spacing w:before="0" w:after="60"/>
-              <w:keepNext/>
-              <w:jc w:val="end"/>
-            </w:pPr>
-            <w:r>
-              <w:rPr>
-                <w:rFonts w:ascii="Calibri" w:hAnsi="Calibri"/>
-                <w:sz w:val="20"/>
-              </w:rPr>
-              <w:t xml:space="default">-0.305</w:t>
-            </w:r>
-          </w:p>
-        </w:tc>
-        <w:tc>
-          <w:tcPr>
-            <w:tcBorders>
-              <w:top w:val="single" w:space="0" w:color="D3D3D3"/>
-              <w:bottom w:val="single" w:space="0" w:color="D3D3D3"/>
-              <w:start w:val="single" w:space="0" w:color="D3D3D3"/>
-              <w:end w:val="single" w:space="0" w:color="D3D3D3"/>
-            </w:tcBorders>
-          </w:tcPr>
-          <w:p>
-            <w:pPr>
-              <w:spacing w:before="0" w:after="60"/>
-              <w:keepNext/>
-              <w:jc w:val="end"/>
-            </w:pPr>
-            <w:r>
-              <w:rPr>
-                <w:rFonts w:ascii="Calibri" w:hAnsi="Calibri"/>
-                <w:sz w:val="20"/>
-              </w:rPr>
-              <w:t xml:space="default">0.142</w:t>
-            </w:r>
-          </w:p>
-        </w:tc>
-        <w:tc>
-          <w:tcPr>
-            <w:tcBorders>
-              <w:top w:val="single" w:space="0" w:color="D3D3D3"/>
-              <w:bottom w:val="single" w:space="0" w:color="D3D3D3"/>
-              <w:start w:val="single" w:space="0" w:color="D3D3D3"/>
-              <w:end w:val="single" w:space="0" w:color="D3D3D3"/>
-            </w:tcBorders>
-          </w:tcPr>
-          <w:p>
-            <w:pPr>
-              <w:spacing w:before="0" w:after="60"/>
-              <w:keepNext/>
-              <w:jc w:val="end"/>
-            </w:pPr>
-            <w:r>
-              <w:rPr>
-                <w:rFonts w:ascii="Calibri" w:hAnsi="Calibri"/>
-                <w:sz w:val="20"/>
-              </w:rPr>
-              <w:t xml:space="default">0.031</w:t>
-            </w:r>
-          </w:p>
-        </w:tc>
-        <w:tc>
-          <w:tcPr>
-            <w:tcBorders>
-              <w:top w:val="single" w:space="0" w:color="D3D3D3"/>
-              <w:bottom w:val="single" w:space="0" w:color="D3D3D3"/>
-              <w:start w:val="single" w:space="0" w:color="D3D3D3"/>
-              <w:end w:val="single" w:space="0" w:color="D3D3D3"/>
-            </w:tcBorders>
-          </w:tcPr>
-          <w:p>
-            <w:pPr>
-              <w:spacing w:before="0" w:after="60"/>
-              <w:keepNext/>
-              <w:jc w:val="end"/>
-            </w:pPr>
-            <w:r>
-              <w:rPr>
-                <w:rFonts w:ascii="Calibri" w:hAnsi="Calibri"/>
-                <w:sz w:val="20"/>
-              </w:rPr>
-              <w:t xml:space="default">0.19</w:t>
-            </w:r>
-          </w:p>
-        </w:tc>
-        <w:tc>
-          <w:tcPr>
-            <w:tcBorders>
-              <w:top w:val="single" w:space="0" w:color="D3D3D3"/>
-              <w:bottom w:val="single" w:space="0" w:color="D3D3D3"/>
-              <w:start w:val="single" w:space="0" w:color="D3D3D3"/>
-              <w:end w:val="single" w:space="0" w:color="D3D3D3"/>
-            </w:tcBorders>
-          </w:tcPr>
-          <w:p>
-            <w:pPr>
-              <w:spacing w:before="0" w:after="60"/>
-              <w:keepNext/>
-              <w:jc w:val="end"/>
-            </w:pPr>
-            <w:r>
-              <w:rPr>
-                <w:rFonts w:ascii="Calibri" w:hAnsi="Calibri"/>
-                <w:sz w:val="20"/>
-              </w:rPr>
-              <w:t xml:space="default">0.57</w:t>
+              <w:t xml:space="default">ClimPC1_s</w:t>
+            </w:r>
+          </w:p>
+        </w:tc>
+        <w:tc>
+          <w:tcPr>
+            <w:tcBorders>
+              <w:top w:val="single" w:space="0" w:color="D3D3D3"/>
+              <w:bottom w:val="single" w:space="0" w:color="D3D3D3"/>
+              <w:start w:val="single" w:space="0" w:color="D3D3D3"/>
+              <w:end w:val="single" w:space="0" w:color="D3D3D3"/>
+            </w:tcBorders>
+          </w:tcPr>
+          <w:p>
+            <w:pPr>
+              <w:spacing w:before="0" w:after="60"/>
+              <w:keepNext/>
+              <w:jc w:val="end"/>
+            </w:pPr>
+            <w:r>
+              <w:rPr>
+                <w:rFonts w:ascii="Calibri" w:hAnsi="Calibri"/>
+                <w:sz w:val="20"/>
+              </w:rPr>
+              <w:t xml:space="default">0.332</w:t>
+            </w:r>
+          </w:p>
+        </w:tc>
+        <w:tc>
+          <w:tcPr>
+            <w:tcBorders>
+              <w:top w:val="single" w:space="0" w:color="D3D3D3"/>
+              <w:bottom w:val="single" w:space="0" w:color="D3D3D3"/>
+              <w:start w:val="single" w:space="0" w:color="D3D3D3"/>
+              <w:end w:val="single" w:space="0" w:color="D3D3D3"/>
+            </w:tcBorders>
+          </w:tcPr>
+          <w:p>
+            <w:pPr>
+              <w:spacing w:before="0" w:after="60"/>
+              <w:keepNext/>
+              <w:jc w:val="end"/>
+            </w:pPr>
+            <w:r>
+              <w:rPr>
+                <w:rFonts w:ascii="Calibri" w:hAnsi="Calibri"/>
+                <w:sz w:val="20"/>
+              </w:rPr>
+              <w:t xml:space="default">0.149</w:t>
+            </w:r>
+          </w:p>
+        </w:tc>
+        <w:tc>
+          <w:tcPr>
+            <w:tcBorders>
+              <w:top w:val="single" w:space="0" w:color="D3D3D3"/>
+              <w:bottom w:val="single" w:space="0" w:color="D3D3D3"/>
+              <w:start w:val="single" w:space="0" w:color="D3D3D3"/>
+              <w:end w:val="single" w:space="0" w:color="D3D3D3"/>
+            </w:tcBorders>
+          </w:tcPr>
+          <w:p>
+            <w:pPr>
+              <w:spacing w:before="0" w:after="60"/>
+              <w:keepNext/>
+              <w:jc w:val="end"/>
+            </w:pPr>
+            <w:r>
+              <w:rPr>
+                <w:rFonts w:ascii="Calibri" w:hAnsi="Calibri"/>
+                <w:sz w:val="20"/>
+              </w:rPr>
+              <w:t xml:space="default">0.026</w:t>
+            </w:r>
+          </w:p>
+        </w:tc>
+        <w:tc>
+          <w:tcPr>
+            <w:tcBorders>
+              <w:top w:val="single" w:space="0" w:color="D3D3D3"/>
+              <w:bottom w:val="single" w:space="0" w:color="D3D3D3"/>
+              <w:start w:val="single" w:space="0" w:color="D3D3D3"/>
+              <w:end w:val="single" w:space="0" w:color="D3D3D3"/>
+            </w:tcBorders>
+          </w:tcPr>
+          <w:p>
+            <w:pPr>
+              <w:spacing w:before="0" w:after="60"/>
+              <w:keepNext/>
+              <w:jc w:val="end"/>
+            </w:pPr>
+            <w:r>
+              <w:rPr>
+                <w:rFonts w:ascii="Calibri" w:hAnsi="Calibri"/>
+                <w:sz w:val="20"/>
+              </w:rPr>
+              <w:t xml:space="default">0.20</w:t>
+            </w:r>
+          </w:p>
+        </w:tc>
+        <w:tc>
+          <w:tcPr>
+            <w:tcBorders>
+              <w:top w:val="single" w:space="0" w:color="D3D3D3"/>
+              <w:bottom w:val="single" w:space="0" w:color="D3D3D3"/>
+              <w:start w:val="single" w:space="0" w:color="D3D3D3"/>
+              <w:end w:val="single" w:space="0" w:color="D3D3D3"/>
+            </w:tcBorders>
+          </w:tcPr>
+          <w:p>
+            <w:pPr>
+              <w:spacing w:before="0" w:after="60"/>
+              <w:keepNext/>
+              <w:jc w:val="end"/>
+            </w:pPr>
+            <w:r>
+              <w:rPr>
+                <w:rFonts w:ascii="Calibri" w:hAnsi="Calibri"/>
+                <w:sz w:val="20"/>
+              </w:rPr>
+              <w:t xml:space="default">0.58</w:t>
             </w:r>
           </w:p>
         </w:tc>
@@ -435,127 +426,127 @@
                 <w:rFonts w:ascii="Calibri" w:hAnsi="Calibri"/>
                 <w:sz w:val="20"/>
               </w:rPr>
-              <w:t xml:space="default">Clim_PC1_s2</w:t>
-            </w:r>
-          </w:p>
-        </w:tc>
-        <w:tc>
-          <w:tcPr>
-            <w:tcBorders>
-              <w:top w:val="single" w:space="0" w:color="D3D3D3"/>
-              <w:bottom w:val="single" w:space="0" w:color="D3D3D3"/>
-              <w:start w:val="single" w:space="0" w:color="D3D3D3"/>
-              <w:end w:val="single" w:space="0" w:color="D3D3D3"/>
-            </w:tcBorders>
-          </w:tcPr>
-          <w:p>
-            <w:pPr>
-              <w:spacing w:before="0" w:after="60"/>
-              <w:keepNext/>
-              <w:jc w:val="end"/>
-            </w:pPr>
-            <w:r>
-              <w:rPr>
-                <w:rFonts w:ascii="Calibri" w:hAnsi="Calibri"/>
-                <w:sz w:val="20"/>
-              </w:rPr>
-              <w:t xml:space="default">-0.446</w:t>
-            </w:r>
-          </w:p>
-        </w:tc>
-        <w:tc>
-          <w:tcPr>
-            <w:tcBorders>
-              <w:top w:val="single" w:space="0" w:color="D3D3D3"/>
-              <w:bottom w:val="single" w:space="0" w:color="D3D3D3"/>
-              <w:start w:val="single" w:space="0" w:color="D3D3D3"/>
-              <w:end w:val="single" w:space="0" w:color="D3D3D3"/>
-            </w:tcBorders>
-          </w:tcPr>
-          <w:p>
-            <w:pPr>
-              <w:spacing w:before="0" w:after="60"/>
-              <w:keepNext/>
-              <w:jc w:val="end"/>
-            </w:pPr>
-            <w:r>
-              <w:rPr>
-                <w:rFonts w:ascii="Calibri" w:hAnsi="Calibri"/>
-                <w:sz w:val="20"/>
-              </w:rPr>
-              <w:t xml:space="default">0.148</w:t>
-            </w:r>
-          </w:p>
-        </w:tc>
-        <w:tc>
-          <w:tcPr>
-            <w:tcBorders>
-              <w:top w:val="single" w:space="0" w:color="D3D3D3"/>
-              <w:bottom w:val="single" w:space="0" w:color="D3D3D3"/>
-              <w:start w:val="single" w:space="0" w:color="D3D3D3"/>
-              <w:end w:val="single" w:space="0" w:color="D3D3D3"/>
-            </w:tcBorders>
-          </w:tcPr>
-          <w:p>
-            <w:pPr>
-              <w:spacing w:before="0" w:after="60"/>
-              <w:keepNext/>
-              <w:jc w:val="end"/>
-            </w:pPr>
-            <w:r>
-              <w:rPr>
-                <w:rFonts w:ascii="Calibri" w:hAnsi="Calibri"/>
-                <w:sz w:val="20"/>
-              </w:rPr>
-              <w:t xml:space="default">0.002</w:t>
-            </w:r>
-          </w:p>
-        </w:tc>
-        <w:tc>
-          <w:tcPr>
-            <w:tcBorders>
-              <w:top w:val="single" w:space="0" w:color="D3D3D3"/>
-              <w:bottom w:val="single" w:space="0" w:color="D3D3D3"/>
-              <w:start w:val="single" w:space="0" w:color="D3D3D3"/>
-              <w:end w:val="single" w:space="0" w:color="D3D3D3"/>
-            </w:tcBorders>
-          </w:tcPr>
-          <w:p>
-            <w:pPr>
-              <w:spacing w:before="0" w:after="60"/>
-              <w:keepNext/>
-              <w:jc w:val="end"/>
-            </w:pPr>
-            <w:r>
-              <w:rPr>
-                <w:rFonts w:ascii="Calibri" w:hAnsi="Calibri"/>
-                <w:sz w:val="20"/>
-              </w:rPr>
-              <w:t xml:space="default">0.19</w:t>
-            </w:r>
-          </w:p>
-        </w:tc>
-        <w:tc>
-          <w:tcPr>
-            <w:tcBorders>
-              <w:top w:val="single" w:space="0" w:color="D3D3D3"/>
-              <w:bottom w:val="single" w:space="0" w:color="D3D3D3"/>
-              <w:start w:val="single" w:space="0" w:color="D3D3D3"/>
-              <w:end w:val="single" w:space="0" w:color="D3D3D3"/>
-            </w:tcBorders>
-          </w:tcPr>
-          <w:p>
-            <w:pPr>
-              <w:spacing w:before="0" w:after="60"/>
-              <w:keepNext/>
-              <w:jc w:val="end"/>
-            </w:pPr>
-            <w:r>
-              <w:rPr>
-                <w:rFonts w:ascii="Calibri" w:hAnsi="Calibri"/>
-                <w:sz w:val="20"/>
-              </w:rPr>
-              <w:t xml:space="default">0.57</w:t>
+              <w:t xml:space="default">ClimPC1_s2</w:t>
+            </w:r>
+          </w:p>
+        </w:tc>
+        <w:tc>
+          <w:tcPr>
+            <w:tcBorders>
+              <w:top w:val="single" w:space="0" w:color="D3D3D3"/>
+              <w:bottom w:val="single" w:space="0" w:color="D3D3D3"/>
+              <w:start w:val="single" w:space="0" w:color="D3D3D3"/>
+              <w:end w:val="single" w:space="0" w:color="D3D3D3"/>
+            </w:tcBorders>
+          </w:tcPr>
+          <w:p>
+            <w:pPr>
+              <w:spacing w:before="0" w:after="60"/>
+              <w:keepNext/>
+              <w:jc w:val="end"/>
+            </w:pPr>
+            <w:r>
+              <w:rPr>
+                <w:rFonts w:ascii="Calibri" w:hAnsi="Calibri"/>
+                <w:sz w:val="20"/>
+              </w:rPr>
+              <w:t xml:space="default">-0.454</w:t>
+            </w:r>
+          </w:p>
+        </w:tc>
+        <w:tc>
+          <w:tcPr>
+            <w:tcBorders>
+              <w:top w:val="single" w:space="0" w:color="D3D3D3"/>
+              <w:bottom w:val="single" w:space="0" w:color="D3D3D3"/>
+              <w:start w:val="single" w:space="0" w:color="D3D3D3"/>
+              <w:end w:val="single" w:space="0" w:color="D3D3D3"/>
+            </w:tcBorders>
+          </w:tcPr>
+          <w:p>
+            <w:pPr>
+              <w:spacing w:before="0" w:after="60"/>
+              <w:keepNext/>
+              <w:jc w:val="end"/>
+            </w:pPr>
+            <w:r>
+              <w:rPr>
+                <w:rFonts w:ascii="Calibri" w:hAnsi="Calibri"/>
+                <w:sz w:val="20"/>
+              </w:rPr>
+              <w:t xml:space="default">0.151</w:t>
+            </w:r>
+          </w:p>
+        </w:tc>
+        <w:tc>
+          <w:tcPr>
+            <w:tcBorders>
+              <w:top w:val="single" w:space="0" w:color="D3D3D3"/>
+              <w:bottom w:val="single" w:space="0" w:color="D3D3D3"/>
+              <w:start w:val="single" w:space="0" w:color="D3D3D3"/>
+              <w:end w:val="single" w:space="0" w:color="D3D3D3"/>
+            </w:tcBorders>
+          </w:tcPr>
+          <w:p>
+            <w:pPr>
+              <w:spacing w:before="0" w:after="60"/>
+              <w:keepNext/>
+              <w:jc w:val="end"/>
+            </w:pPr>
+            <w:r>
+              <w:rPr>
+                <w:rFonts w:ascii="Calibri" w:hAnsi="Calibri"/>
+                <w:sz w:val="20"/>
+              </w:rPr>
+              <w:t xml:space="default">0.003</w:t>
+            </w:r>
+          </w:p>
+        </w:tc>
+        <w:tc>
+          <w:tcPr>
+            <w:tcBorders>
+              <w:top w:val="single" w:space="0" w:color="D3D3D3"/>
+              <w:bottom w:val="single" w:space="0" w:color="D3D3D3"/>
+              <w:start w:val="single" w:space="0" w:color="D3D3D3"/>
+              <w:end w:val="single" w:space="0" w:color="D3D3D3"/>
+            </w:tcBorders>
+          </w:tcPr>
+          <w:p>
+            <w:pPr>
+              <w:spacing w:before="0" w:after="60"/>
+              <w:keepNext/>
+              <w:jc w:val="end"/>
+            </w:pPr>
+            <w:r>
+              <w:rPr>
+                <w:rFonts w:ascii="Calibri" w:hAnsi="Calibri"/>
+                <w:sz w:val="20"/>
+              </w:rPr>
+              <w:t xml:space="default">0.20</w:t>
+            </w:r>
+          </w:p>
+        </w:tc>
+        <w:tc>
+          <w:tcPr>
+            <w:tcBorders>
+              <w:top w:val="single" w:space="0" w:color="D3D3D3"/>
+              <w:bottom w:val="single" w:space="0" w:color="D3D3D3"/>
+              <w:start w:val="single" w:space="0" w:color="D3D3D3"/>
+              <w:end w:val="single" w:space="0" w:color="D3D3D3"/>
+            </w:tcBorders>
+          </w:tcPr>
+          <w:p>
+            <w:pPr>
+              <w:spacing w:before="0" w:after="60"/>
+              <w:keepNext/>
+              <w:jc w:val="end"/>
+            </w:pPr>
+            <w:r>
+              <w:rPr>
+                <w:rFonts w:ascii="Calibri" w:hAnsi="Calibri"/>
+                <w:sz w:val="20"/>
+              </w:rPr>
+              <w:t xml:space="default">0.58</w:t>
             </w:r>
           </w:p>
         </w:tc>
@@ -608,103 +599,103 @@
                 <w:rFonts w:ascii="Calibri" w:hAnsi="Calibri"/>
                 <w:sz w:val="20"/>
               </w:rPr>
-              <w:t xml:space="default">-0.068</w:t>
-            </w:r>
-          </w:p>
-        </w:tc>
-        <w:tc>
-          <w:tcPr>
-            <w:tcBorders>
-              <w:top w:val="single" w:space="0" w:color="D3D3D3"/>
-              <w:bottom w:val="single" w:space="0" w:color="D3D3D3"/>
-              <w:start w:val="single" w:space="0" w:color="D3D3D3"/>
-              <w:end w:val="single" w:space="0" w:color="D3D3D3"/>
-            </w:tcBorders>
-          </w:tcPr>
-          <w:p>
-            <w:pPr>
-              <w:spacing w:before="0" w:after="60"/>
-              <w:keepNext/>
-              <w:jc w:val="end"/>
-            </w:pPr>
-            <w:r>
-              <w:rPr>
-                <w:rFonts w:ascii="Calibri" w:hAnsi="Calibri"/>
-                <w:sz w:val="20"/>
-              </w:rPr>
-              <w:t xml:space="default">0.046</w:t>
-            </w:r>
-          </w:p>
-        </w:tc>
-        <w:tc>
-          <w:tcPr>
-            <w:tcBorders>
-              <w:top w:val="single" w:space="0" w:color="D3D3D3"/>
-              <w:bottom w:val="single" w:space="0" w:color="D3D3D3"/>
-              <w:start w:val="single" w:space="0" w:color="D3D3D3"/>
-              <w:end w:val="single" w:space="0" w:color="D3D3D3"/>
-            </w:tcBorders>
-          </w:tcPr>
-          <w:p>
-            <w:pPr>
-              <w:spacing w:before="0" w:after="60"/>
-              <w:keepNext/>
-              <w:jc w:val="end"/>
-            </w:pPr>
-            <w:r>
-              <w:rPr>
-                <w:rFonts w:ascii="Calibri" w:hAnsi="Calibri"/>
-                <w:sz w:val="20"/>
-              </w:rPr>
-              <w:t xml:space="default">0.141</w:t>
-            </w:r>
-          </w:p>
-        </w:tc>
-        <w:tc>
-          <w:tcPr>
-            <w:tcBorders>
-              <w:top w:val="single" w:space="0" w:color="D3D3D3"/>
-              <w:bottom w:val="single" w:space="0" w:color="D3D3D3"/>
-              <w:start w:val="single" w:space="0" w:color="D3D3D3"/>
-              <w:end w:val="single" w:space="0" w:color="D3D3D3"/>
-            </w:tcBorders>
-          </w:tcPr>
-          <w:p>
-            <w:pPr>
-              <w:spacing w:before="0" w:after="60"/>
-              <w:keepNext/>
-              <w:jc w:val="end"/>
-            </w:pPr>
-            <w:r>
-              <w:rPr>
-                <w:rFonts w:ascii="Calibri" w:hAnsi="Calibri"/>
-                <w:sz w:val="20"/>
-              </w:rPr>
-              <w:t xml:space="default">0.19</w:t>
-            </w:r>
-          </w:p>
-        </w:tc>
-        <w:tc>
-          <w:tcPr>
-            <w:tcBorders>
-              <w:top w:val="single" w:space="0" w:color="D3D3D3"/>
-              <w:bottom w:val="single" w:space="0" w:color="D3D3D3"/>
-              <w:start w:val="single" w:space="0" w:color="D3D3D3"/>
-              <w:end w:val="single" w:space="0" w:color="D3D3D3"/>
-            </w:tcBorders>
-          </w:tcPr>
-          <w:p>
-            <w:pPr>
-              <w:spacing w:before="0" w:after="60"/>
-              <w:keepNext/>
-              <w:jc w:val="end"/>
-            </w:pPr>
-            <w:r>
-              <w:rPr>
-                <w:rFonts w:ascii="Calibri" w:hAnsi="Calibri"/>
-                <w:sz w:val="20"/>
-              </w:rPr>
-              <w:t xml:space="default">0.57</w:t>
+              <w:t xml:space="default">-0.051</w:t>
+            </w:r>
+          </w:p>
+        </w:tc>
+        <w:tc>
+          <w:tcPr>
+            <w:tcBorders>
+              <w:top w:val="single" w:space="0" w:color="D3D3D3"/>
+              <w:bottom w:val="single" w:space="0" w:color="D3D3D3"/>
+              <w:start w:val="single" w:space="0" w:color="D3D3D3"/>
+              <w:end w:val="single" w:space="0" w:color="D3D3D3"/>
+            </w:tcBorders>
+          </w:tcPr>
+          <w:p>
+            <w:pPr>
+              <w:spacing w:before="0" w:after="60"/>
+              <w:keepNext/>
+              <w:jc w:val="end"/>
+            </w:pPr>
+            <w:r>
+              <w:rPr>
+                <w:rFonts w:ascii="Calibri" w:hAnsi="Calibri"/>
+                <w:sz w:val="20"/>
+              </w:rPr>
+              <w:t xml:space="default">0.044</w:t>
+            </w:r>
+          </w:p>
+        </w:tc>
+        <w:tc>
+          <w:tcPr>
+            <w:tcBorders>
+              <w:top w:val="single" w:space="0" w:color="D3D3D3"/>
+              <w:bottom w:val="single" w:space="0" w:color="D3D3D3"/>
+              <w:start w:val="single" w:space="0" w:color="D3D3D3"/>
+              <w:end w:val="single" w:space="0" w:color="D3D3D3"/>
+            </w:tcBorders>
+          </w:tcPr>
+          <w:p>
+            <w:pPr>
+              <w:spacing w:before="0" w:after="60"/>
+              <w:keepNext/>
+              <w:jc w:val="end"/>
+            </w:pPr>
+            <w:r>
+              <w:rPr>
+                <w:rFonts w:ascii="Calibri" w:hAnsi="Calibri"/>
+                <w:sz w:val="20"/>
+              </w:rPr>
+              <w:t xml:space="default">0.251</w:t>
+            </w:r>
+          </w:p>
+        </w:tc>
+        <w:tc>
+          <w:tcPr>
+            <w:tcBorders>
+              <w:top w:val="single" w:space="0" w:color="D3D3D3"/>
+              <w:bottom w:val="single" w:space="0" w:color="D3D3D3"/>
+              <w:start w:val="single" w:space="0" w:color="D3D3D3"/>
+              <w:end w:val="single" w:space="0" w:color="D3D3D3"/>
+            </w:tcBorders>
+          </w:tcPr>
+          <w:p>
+            <w:pPr>
+              <w:spacing w:before="0" w:after="60"/>
+              <w:keepNext/>
+              <w:jc w:val="end"/>
+            </w:pPr>
+            <w:r>
+              <w:rPr>
+                <w:rFonts w:ascii="Calibri" w:hAnsi="Calibri"/>
+                <w:sz w:val="20"/>
+              </w:rPr>
+              <w:t xml:space="default">0.20</w:t>
+            </w:r>
+          </w:p>
+        </w:tc>
+        <w:tc>
+          <w:tcPr>
+            <w:tcBorders>
+              <w:top w:val="single" w:space="0" w:color="D3D3D3"/>
+              <w:bottom w:val="single" w:space="0" w:color="D3D3D3"/>
+              <w:start w:val="single" w:space="0" w:color="D3D3D3"/>
+              <w:end w:val="single" w:space="0" w:color="D3D3D3"/>
+            </w:tcBorders>
+          </w:tcPr>
+          <w:p>
+            <w:pPr>
+              <w:spacing w:before="0" w:after="60"/>
+              <w:keepNext/>
+              <w:jc w:val="end"/>
+            </w:pPr>
+            <w:r>
+              <w:rPr>
+                <w:rFonts w:ascii="Calibri" w:hAnsi="Calibri"/>
+                <w:sz w:val="20"/>
+              </w:rPr>
+              <w:t xml:space="default">0.58</w:t>
             </w:r>
           </w:p>
         </w:tc>
@@ -757,103 +748,103 @@
                 <w:rFonts w:ascii="Calibri" w:hAnsi="Calibri"/>
                 <w:sz w:val="20"/>
               </w:rPr>
-              <w:t xml:space="default">-0.120</w:t>
-            </w:r>
-          </w:p>
-        </w:tc>
-        <w:tc>
-          <w:tcPr>
-            <w:tcBorders>
-              <w:top w:val="single" w:space="0" w:color="D3D3D3"/>
-              <w:bottom w:val="single" w:space="0" w:color="D3D3D3"/>
-              <w:start w:val="single" w:space="0" w:color="D3D3D3"/>
-              <w:end w:val="single" w:space="0" w:color="D3D3D3"/>
-            </w:tcBorders>
-          </w:tcPr>
-          <w:p>
-            <w:pPr>
-              <w:spacing w:before="0" w:after="60"/>
-              <w:keepNext/>
-              <w:jc w:val="end"/>
-            </w:pPr>
-            <w:r>
-              <w:rPr>
-                <w:rFonts w:ascii="Calibri" w:hAnsi="Calibri"/>
-                <w:sz w:val="20"/>
-              </w:rPr>
-              <w:t xml:space="default">0.074</w:t>
-            </w:r>
-          </w:p>
-        </w:tc>
-        <w:tc>
-          <w:tcPr>
-            <w:tcBorders>
-              <w:top w:val="single" w:space="0" w:color="D3D3D3"/>
-              <w:bottom w:val="single" w:space="0" w:color="D3D3D3"/>
-              <w:start w:val="single" w:space="0" w:color="D3D3D3"/>
-              <w:end w:val="single" w:space="0" w:color="D3D3D3"/>
-            </w:tcBorders>
-          </w:tcPr>
-          <w:p>
-            <w:pPr>
-              <w:spacing w:before="0" w:after="60"/>
-              <w:keepNext/>
-              <w:jc w:val="end"/>
-            </w:pPr>
-            <w:r>
-              <w:rPr>
-                <w:rFonts w:ascii="Calibri" w:hAnsi="Calibri"/>
-                <w:sz w:val="20"/>
-              </w:rPr>
-              <w:t xml:space="default">0.101</w:t>
-            </w:r>
-          </w:p>
-        </w:tc>
-        <w:tc>
-          <w:tcPr>
-            <w:tcBorders>
-              <w:top w:val="single" w:space="0" w:color="D3D3D3"/>
-              <w:bottom w:val="single" w:space="0" w:color="D3D3D3"/>
-              <w:start w:val="single" w:space="0" w:color="D3D3D3"/>
-              <w:end w:val="single" w:space="0" w:color="D3D3D3"/>
-            </w:tcBorders>
-          </w:tcPr>
-          <w:p>
-            <w:pPr>
-              <w:spacing w:before="0" w:after="60"/>
-              <w:keepNext/>
-              <w:jc w:val="end"/>
-            </w:pPr>
-            <w:r>
-              <w:rPr>
-                <w:rFonts w:ascii="Calibri" w:hAnsi="Calibri"/>
-                <w:sz w:val="20"/>
-              </w:rPr>
-              <w:t xml:space="default">0.19</w:t>
-            </w:r>
-          </w:p>
-        </w:tc>
-        <w:tc>
-          <w:tcPr>
-            <w:tcBorders>
-              <w:top w:val="single" w:space="0" w:color="D3D3D3"/>
-              <w:bottom w:val="single" w:space="0" w:color="D3D3D3"/>
-              <w:start w:val="single" w:space="0" w:color="D3D3D3"/>
-              <w:end w:val="single" w:space="0" w:color="D3D3D3"/>
-            </w:tcBorders>
-          </w:tcPr>
-          <w:p>
-            <w:pPr>
-              <w:spacing w:before="0" w:after="60"/>
-              <w:keepNext/>
-              <w:jc w:val="end"/>
-            </w:pPr>
-            <w:r>
-              <w:rPr>
-                <w:rFonts w:ascii="Calibri" w:hAnsi="Calibri"/>
-                <w:sz w:val="20"/>
-              </w:rPr>
-              <w:t xml:space="default">0.57</w:t>
+              <w:t xml:space="default">-0.073</w:t>
+            </w:r>
+          </w:p>
+        </w:tc>
+        <w:tc>
+          <w:tcPr>
+            <w:tcBorders>
+              <w:top w:val="single" w:space="0" w:color="D3D3D3"/>
+              <w:bottom w:val="single" w:space="0" w:color="D3D3D3"/>
+              <w:start w:val="single" w:space="0" w:color="D3D3D3"/>
+              <w:end w:val="single" w:space="0" w:color="D3D3D3"/>
+            </w:tcBorders>
+          </w:tcPr>
+          <w:p>
+            <w:pPr>
+              <w:spacing w:before="0" w:after="60"/>
+              <w:keepNext/>
+              <w:jc w:val="end"/>
+            </w:pPr>
+            <w:r>
+              <w:rPr>
+                <w:rFonts w:ascii="Calibri" w:hAnsi="Calibri"/>
+                <w:sz w:val="20"/>
+              </w:rPr>
+              <w:t xml:space="default">0.051</w:t>
+            </w:r>
+          </w:p>
+        </w:tc>
+        <w:tc>
+          <w:tcPr>
+            <w:tcBorders>
+              <w:top w:val="single" w:space="0" w:color="D3D3D3"/>
+              <w:bottom w:val="single" w:space="0" w:color="D3D3D3"/>
+              <w:start w:val="single" w:space="0" w:color="D3D3D3"/>
+              <w:end w:val="single" w:space="0" w:color="D3D3D3"/>
+            </w:tcBorders>
+          </w:tcPr>
+          <w:p>
+            <w:pPr>
+              <w:spacing w:before="0" w:after="60"/>
+              <w:keepNext/>
+              <w:jc w:val="end"/>
+            </w:pPr>
+            <w:r>
+              <w:rPr>
+                <w:rFonts w:ascii="Calibri" w:hAnsi="Calibri"/>
+                <w:sz w:val="20"/>
+              </w:rPr>
+              <w:t xml:space="default">0.146</w:t>
+            </w:r>
+          </w:p>
+        </w:tc>
+        <w:tc>
+          <w:tcPr>
+            <w:tcBorders>
+              <w:top w:val="single" w:space="0" w:color="D3D3D3"/>
+              <w:bottom w:val="single" w:space="0" w:color="D3D3D3"/>
+              <w:start w:val="single" w:space="0" w:color="D3D3D3"/>
+              <w:end w:val="single" w:space="0" w:color="D3D3D3"/>
+            </w:tcBorders>
+          </w:tcPr>
+          <w:p>
+            <w:pPr>
+              <w:spacing w:before="0" w:after="60"/>
+              <w:keepNext/>
+              <w:jc w:val="end"/>
+            </w:pPr>
+            <w:r>
+              <w:rPr>
+                <w:rFonts w:ascii="Calibri" w:hAnsi="Calibri"/>
+                <w:sz w:val="20"/>
+              </w:rPr>
+              <w:t xml:space="default">0.20</w:t>
+            </w:r>
+          </w:p>
+        </w:tc>
+        <w:tc>
+          <w:tcPr>
+            <w:tcBorders>
+              <w:top w:val="single" w:space="0" w:color="D3D3D3"/>
+              <w:bottom w:val="single" w:space="0" w:color="D3D3D3"/>
+              <w:start w:val="single" w:space="0" w:color="D3D3D3"/>
+              <w:end w:val="single" w:space="0" w:color="D3D3D3"/>
+            </w:tcBorders>
+          </w:tcPr>
+          <w:p>
+            <w:pPr>
+              <w:spacing w:before="0" w:after="60"/>
+              <w:keepNext/>
+              <w:jc w:val="end"/>
+            </w:pPr>
+            <w:r>
+              <w:rPr>
+                <w:rFonts w:ascii="Calibri" w:hAnsi="Calibri"/>
+                <w:sz w:val="20"/>
+              </w:rPr>
+              <w:t xml:space="default">0.58</w:t>
             </w:r>
           </w:p>
         </w:tc>
@@ -906,7 +897,7 @@
                 <w:rFonts w:ascii="Calibri" w:hAnsi="Calibri"/>
                 <w:sz w:val="20"/>
               </w:rPr>
-              <w:t xml:space="default">-0.224</w:t>
+              <w:t xml:space="default">-0.232</w:t>
             </w:r>
           </w:p>
         </w:tc>
@@ -954,55 +945,55 @@
                 <w:rFonts w:ascii="Calibri" w:hAnsi="Calibri"/>
                 <w:sz w:val="20"/>
               </w:rPr>
-              <w:t xml:space="default">0.005</w:t>
-            </w:r>
-          </w:p>
-        </w:tc>
-        <w:tc>
-          <w:tcPr>
-            <w:tcBorders>
-              <w:top w:val="single" w:space="0" w:color="D3D3D3"/>
-              <w:bottom w:val="single" w:space="0" w:color="D3D3D3"/>
-              <w:start w:val="single" w:space="0" w:color="D3D3D3"/>
-              <w:end w:val="single" w:space="0" w:color="D3D3D3"/>
-            </w:tcBorders>
-          </w:tcPr>
-          <w:p>
-            <w:pPr>
-              <w:spacing w:before="0" w:after="60"/>
-              <w:keepNext/>
-              <w:jc w:val="end"/>
-            </w:pPr>
-            <w:r>
-              <w:rPr>
-                <w:rFonts w:ascii="Calibri" w:hAnsi="Calibri"/>
-                <w:sz w:val="20"/>
-              </w:rPr>
-              <w:t xml:space="default">0.19</w:t>
-            </w:r>
-          </w:p>
-        </w:tc>
-        <w:tc>
-          <w:tcPr>
-            <w:tcBorders>
-              <w:top w:val="single" w:space="0" w:color="D3D3D3"/>
-              <w:bottom w:val="single" w:space="0" w:color="D3D3D3"/>
-              <w:start w:val="single" w:space="0" w:color="D3D3D3"/>
-              <w:end w:val="single" w:space="0" w:color="D3D3D3"/>
-            </w:tcBorders>
-          </w:tcPr>
-          <w:p>
-            <w:pPr>
-              <w:spacing w:before="0" w:after="60"/>
-              <w:keepNext/>
-              <w:jc w:val="end"/>
-            </w:pPr>
-            <w:r>
-              <w:rPr>
-                <w:rFonts w:ascii="Calibri" w:hAnsi="Calibri"/>
-                <w:sz w:val="20"/>
-              </w:rPr>
-              <w:t xml:space="default">0.57</w:t>
+              <w:t xml:space="default">0.004</w:t>
+            </w:r>
+          </w:p>
+        </w:tc>
+        <w:tc>
+          <w:tcPr>
+            <w:tcBorders>
+              <w:top w:val="single" w:space="0" w:color="D3D3D3"/>
+              <w:bottom w:val="single" w:space="0" w:color="D3D3D3"/>
+              <w:start w:val="single" w:space="0" w:color="D3D3D3"/>
+              <w:end w:val="single" w:space="0" w:color="D3D3D3"/>
+            </w:tcBorders>
+          </w:tcPr>
+          <w:p>
+            <w:pPr>
+              <w:spacing w:before="0" w:after="60"/>
+              <w:keepNext/>
+              <w:jc w:val="end"/>
+            </w:pPr>
+            <w:r>
+              <w:rPr>
+                <w:rFonts w:ascii="Calibri" w:hAnsi="Calibri"/>
+                <w:sz w:val="20"/>
+              </w:rPr>
+              <w:t xml:space="default">0.20</w:t>
+            </w:r>
+          </w:p>
+        </w:tc>
+        <w:tc>
+          <w:tcPr>
+            <w:tcBorders>
+              <w:top w:val="single" w:space="0" w:color="D3D3D3"/>
+              <w:bottom w:val="single" w:space="0" w:color="D3D3D3"/>
+              <w:start w:val="single" w:space="0" w:color="D3D3D3"/>
+              <w:end w:val="single" w:space="0" w:color="D3D3D3"/>
+            </w:tcBorders>
+          </w:tcPr>
+          <w:p>
+            <w:pPr>
+              <w:spacing w:before="0" w:after="60"/>
+              <w:keepNext/>
+              <w:jc w:val="end"/>
+            </w:pPr>
+            <w:r>
+              <w:rPr>
+                <w:rFonts w:ascii="Calibri" w:hAnsi="Calibri"/>
+                <w:sz w:val="20"/>
+              </w:rPr>
+              <w:t xml:space="default">0.58</w:t>
             </w:r>
           </w:p>
         </w:tc>
@@ -1064,103 +1055,103 @@
                 <w:rFonts w:ascii="Calibri" w:hAnsi="Calibri"/>
                 <w:sz w:val="20"/>
               </w:rPr>
-              <w:t xml:space="default">Clim_PC1_s</w:t>
-            </w:r>
-          </w:p>
-        </w:tc>
-        <w:tc>
-          <w:tcPr>
-            <w:tcBorders>
-              <w:top w:val="single" w:space="0" w:color="D3D3D3"/>
-              <w:bottom w:val="single" w:space="0" w:color="D3D3D3"/>
-              <w:start w:val="single" w:space="0" w:color="D3D3D3"/>
-              <w:end w:val="single" w:space="0" w:color="D3D3D3"/>
-            </w:tcBorders>
-          </w:tcPr>
-          <w:p>
-            <w:pPr>
-              <w:spacing w:before="0" w:after="60"/>
-              <w:keepNext/>
-              <w:jc w:val="end"/>
-            </w:pPr>
-            <w:r>
-              <w:rPr>
-                <w:rFonts w:ascii="Calibri" w:hAnsi="Calibri"/>
-                <w:sz w:val="20"/>
-              </w:rPr>
-              <w:t xml:space="default">0.118</w:t>
-            </w:r>
-          </w:p>
-        </w:tc>
-        <w:tc>
-          <w:tcPr>
-            <w:tcBorders>
-              <w:top w:val="single" w:space="0" w:color="D3D3D3"/>
-              <w:bottom w:val="single" w:space="0" w:color="D3D3D3"/>
-              <w:start w:val="single" w:space="0" w:color="D3D3D3"/>
-              <w:end w:val="single" w:space="0" w:color="D3D3D3"/>
-            </w:tcBorders>
-          </w:tcPr>
-          <w:p>
-            <w:pPr>
-              <w:spacing w:before="0" w:after="60"/>
-              <w:keepNext/>
-              <w:jc w:val="end"/>
-            </w:pPr>
-            <w:r>
-              <w:rPr>
-                <w:rFonts w:ascii="Calibri" w:hAnsi="Calibri"/>
-                <w:sz w:val="20"/>
-              </w:rPr>
-              <w:t xml:space="default">0.106</w:t>
-            </w:r>
-          </w:p>
-        </w:tc>
-        <w:tc>
-          <w:tcPr>
-            <w:tcBorders>
-              <w:top w:val="single" w:space="0" w:color="D3D3D3"/>
-              <w:bottom w:val="single" w:space="0" w:color="D3D3D3"/>
-              <w:start w:val="single" w:space="0" w:color="D3D3D3"/>
-              <w:end w:val="single" w:space="0" w:color="D3D3D3"/>
-            </w:tcBorders>
-          </w:tcPr>
-          <w:p>
-            <w:pPr>
-              <w:spacing w:before="0" w:after="60"/>
-              <w:keepNext/>
-              <w:jc w:val="end"/>
-            </w:pPr>
-            <w:r>
-              <w:rPr>
-                <w:rFonts w:ascii="Calibri" w:hAnsi="Calibri"/>
-                <w:sz w:val="20"/>
-              </w:rPr>
-              <w:t xml:space="default">0.264</w:t>
-            </w:r>
-          </w:p>
-        </w:tc>
-        <w:tc>
-          <w:tcPr>
-            <w:tcBorders>
-              <w:top w:val="single" w:space="0" w:color="D3D3D3"/>
-              <w:bottom w:val="single" w:space="0" w:color="D3D3D3"/>
-              <w:start w:val="single" w:space="0" w:color="D3D3D3"/>
-              <w:end w:val="single" w:space="0" w:color="D3D3D3"/>
-            </w:tcBorders>
-          </w:tcPr>
-          <w:p>
-            <w:pPr>
-              <w:spacing w:before="0" w:after="60"/>
-              <w:keepNext/>
-              <w:jc w:val="end"/>
-            </w:pPr>
-            <w:r>
-              <w:rPr>
-                <w:rFonts w:ascii="Calibri" w:hAnsi="Calibri"/>
-                <w:sz w:val="20"/>
-              </w:rPr>
-              <w:t xml:space="default">0.12</w:t>
+              <w:t xml:space="default">ClimPC1_s</w:t>
+            </w:r>
+          </w:p>
+        </w:tc>
+        <w:tc>
+          <w:tcPr>
+            <w:tcBorders>
+              <w:top w:val="single" w:space="0" w:color="D3D3D3"/>
+              <w:bottom w:val="single" w:space="0" w:color="D3D3D3"/>
+              <w:start w:val="single" w:space="0" w:color="D3D3D3"/>
+              <w:end w:val="single" w:space="0" w:color="D3D3D3"/>
+            </w:tcBorders>
+          </w:tcPr>
+          <w:p>
+            <w:pPr>
+              <w:spacing w:before="0" w:after="60"/>
+              <w:keepNext/>
+              <w:jc w:val="end"/>
+            </w:pPr>
+            <w:r>
+              <w:rPr>
+                <w:rFonts w:ascii="Calibri" w:hAnsi="Calibri"/>
+                <w:sz w:val="20"/>
+              </w:rPr>
+              <w:t xml:space="default">-0.132</w:t>
+            </w:r>
+          </w:p>
+        </w:tc>
+        <w:tc>
+          <w:tcPr>
+            <w:tcBorders>
+              <w:top w:val="single" w:space="0" w:color="D3D3D3"/>
+              <w:bottom w:val="single" w:space="0" w:color="D3D3D3"/>
+              <w:start w:val="single" w:space="0" w:color="D3D3D3"/>
+              <w:end w:val="single" w:space="0" w:color="D3D3D3"/>
+            </w:tcBorders>
+          </w:tcPr>
+          <w:p>
+            <w:pPr>
+              <w:spacing w:before="0" w:after="60"/>
+              <w:keepNext/>
+              <w:jc w:val="end"/>
+            </w:pPr>
+            <w:r>
+              <w:rPr>
+                <w:rFonts w:ascii="Calibri" w:hAnsi="Calibri"/>
+                <w:sz w:val="20"/>
+              </w:rPr>
+              <w:t xml:space="default">0.105</w:t>
+            </w:r>
+          </w:p>
+        </w:tc>
+        <w:tc>
+          <w:tcPr>
+            <w:tcBorders>
+              <w:top w:val="single" w:space="0" w:color="D3D3D3"/>
+              <w:bottom w:val="single" w:space="0" w:color="D3D3D3"/>
+              <w:start w:val="single" w:space="0" w:color="D3D3D3"/>
+              <w:end w:val="single" w:space="0" w:color="D3D3D3"/>
+            </w:tcBorders>
+          </w:tcPr>
+          <w:p>
+            <w:pPr>
+              <w:spacing w:before="0" w:after="60"/>
+              <w:keepNext/>
+              <w:jc w:val="end"/>
+            </w:pPr>
+            <w:r>
+              <w:rPr>
+                <w:rFonts w:ascii="Calibri" w:hAnsi="Calibri"/>
+                <w:sz w:val="20"/>
+              </w:rPr>
+              <w:t xml:space="default">0.210</w:t>
+            </w:r>
+          </w:p>
+        </w:tc>
+        <w:tc>
+          <w:tcPr>
+            <w:tcBorders>
+              <w:top w:val="single" w:space="0" w:color="D3D3D3"/>
+              <w:bottom w:val="single" w:space="0" w:color="D3D3D3"/>
+              <w:start w:val="single" w:space="0" w:color="D3D3D3"/>
+              <w:end w:val="single" w:space="0" w:color="D3D3D3"/>
+            </w:tcBorders>
+          </w:tcPr>
+          <w:p>
+            <w:pPr>
+              <w:spacing w:before="0" w:after="60"/>
+              <w:keepNext/>
+              <w:jc w:val="end"/>
+            </w:pPr>
+            <w:r>
+              <w:rPr>
+                <w:rFonts w:ascii="Calibri" w:hAnsi="Calibri"/>
+                <w:sz w:val="20"/>
+              </w:rPr>
+              <w:t xml:space="default">0.14</w:t>
             </w:r>
           </w:p>
         </w:tc>
@@ -1213,103 +1204,103 @@
                 <w:rFonts w:ascii="Calibri" w:hAnsi="Calibri"/>
                 <w:sz w:val="20"/>
               </w:rPr>
-              <w:t xml:space="default">Clim_PC1_s2</w:t>
-            </w:r>
-          </w:p>
-        </w:tc>
-        <w:tc>
-          <w:tcPr>
-            <w:tcBorders>
-              <w:top w:val="single" w:space="0" w:color="D3D3D3"/>
-              <w:bottom w:val="single" w:space="0" w:color="D3D3D3"/>
-              <w:start w:val="single" w:space="0" w:color="D3D3D3"/>
-              <w:end w:val="single" w:space="0" w:color="D3D3D3"/>
-            </w:tcBorders>
-          </w:tcPr>
-          <w:p>
-            <w:pPr>
-              <w:spacing w:before="0" w:after="60"/>
-              <w:keepNext/>
-              <w:jc w:val="end"/>
-            </w:pPr>
-            <w:r>
-              <w:rPr>
-                <w:rFonts w:ascii="Calibri" w:hAnsi="Calibri"/>
-                <w:sz w:val="20"/>
-              </w:rPr>
-              <w:t xml:space="default">-0.327</w:t>
-            </w:r>
-          </w:p>
-        </w:tc>
-        <w:tc>
-          <w:tcPr>
-            <w:tcBorders>
-              <w:top w:val="single" w:space="0" w:color="D3D3D3"/>
-              <w:bottom w:val="single" w:space="0" w:color="D3D3D3"/>
-              <w:start w:val="single" w:space="0" w:color="D3D3D3"/>
-              <w:end w:val="single" w:space="0" w:color="D3D3D3"/>
-            </w:tcBorders>
-          </w:tcPr>
-          <w:p>
-            <w:pPr>
-              <w:spacing w:before="0" w:after="60"/>
-              <w:keepNext/>
-              <w:jc w:val="end"/>
-            </w:pPr>
-            <w:r>
-              <w:rPr>
-                <w:rFonts w:ascii="Calibri" w:hAnsi="Calibri"/>
-                <w:sz w:val="20"/>
-              </w:rPr>
-              <w:t xml:space="default">0.117</w:t>
-            </w:r>
-          </w:p>
-        </w:tc>
-        <w:tc>
-          <w:tcPr>
-            <w:tcBorders>
-              <w:top w:val="single" w:space="0" w:color="D3D3D3"/>
-              <w:bottom w:val="single" w:space="0" w:color="D3D3D3"/>
-              <w:start w:val="single" w:space="0" w:color="D3D3D3"/>
-              <w:end w:val="single" w:space="0" w:color="D3D3D3"/>
-            </w:tcBorders>
-          </w:tcPr>
-          <w:p>
-            <w:pPr>
-              <w:spacing w:before="0" w:after="60"/>
-              <w:keepNext/>
-              <w:jc w:val="end"/>
-            </w:pPr>
-            <w:r>
-              <w:rPr>
-                <w:rFonts w:ascii="Calibri" w:hAnsi="Calibri"/>
-                <w:sz w:val="20"/>
-              </w:rPr>
-              <w:t xml:space="default">0.005</w:t>
-            </w:r>
-          </w:p>
-        </w:tc>
-        <w:tc>
-          <w:tcPr>
-            <w:tcBorders>
-              <w:top w:val="single" w:space="0" w:color="D3D3D3"/>
-              <w:bottom w:val="single" w:space="0" w:color="D3D3D3"/>
-              <w:start w:val="single" w:space="0" w:color="D3D3D3"/>
-              <w:end w:val="single" w:space="0" w:color="D3D3D3"/>
-            </w:tcBorders>
-          </w:tcPr>
-          <w:p>
-            <w:pPr>
-              <w:spacing w:before="0" w:after="60"/>
-              <w:keepNext/>
-              <w:jc w:val="end"/>
-            </w:pPr>
-            <w:r>
-              <w:rPr>
-                <w:rFonts w:ascii="Calibri" w:hAnsi="Calibri"/>
-                <w:sz w:val="20"/>
-              </w:rPr>
-              <w:t xml:space="default">0.12</w:t>
+              <w:t xml:space="default">ClimPC1_s2</w:t>
+            </w:r>
+          </w:p>
+        </w:tc>
+        <w:tc>
+          <w:tcPr>
+            <w:tcBorders>
+              <w:top w:val="single" w:space="0" w:color="D3D3D3"/>
+              <w:bottom w:val="single" w:space="0" w:color="D3D3D3"/>
+              <w:start w:val="single" w:space="0" w:color="D3D3D3"/>
+              <w:end w:val="single" w:space="0" w:color="D3D3D3"/>
+            </w:tcBorders>
+          </w:tcPr>
+          <w:p>
+            <w:pPr>
+              <w:spacing w:before="0" w:after="60"/>
+              <w:keepNext/>
+              <w:jc w:val="end"/>
+            </w:pPr>
+            <w:r>
+              <w:rPr>
+                <w:rFonts w:ascii="Calibri" w:hAnsi="Calibri"/>
+                <w:sz w:val="20"/>
+              </w:rPr>
+              <w:t xml:space="default">-0.340</w:t>
+            </w:r>
+          </w:p>
+        </w:tc>
+        <w:tc>
+          <w:tcPr>
+            <w:tcBorders>
+              <w:top w:val="single" w:space="0" w:color="D3D3D3"/>
+              <w:bottom w:val="single" w:space="0" w:color="D3D3D3"/>
+              <w:start w:val="single" w:space="0" w:color="D3D3D3"/>
+              <w:end w:val="single" w:space="0" w:color="D3D3D3"/>
+            </w:tcBorders>
+          </w:tcPr>
+          <w:p>
+            <w:pPr>
+              <w:spacing w:before="0" w:after="60"/>
+              <w:keepNext/>
+              <w:jc w:val="end"/>
+            </w:pPr>
+            <w:r>
+              <w:rPr>
+                <w:rFonts w:ascii="Calibri" w:hAnsi="Calibri"/>
+                <w:sz w:val="20"/>
+              </w:rPr>
+              <w:t xml:space="default">0.115</w:t>
+            </w:r>
+          </w:p>
+        </w:tc>
+        <w:tc>
+          <w:tcPr>
+            <w:tcBorders>
+              <w:top w:val="single" w:space="0" w:color="D3D3D3"/>
+              <w:bottom w:val="single" w:space="0" w:color="D3D3D3"/>
+              <w:start w:val="single" w:space="0" w:color="D3D3D3"/>
+              <w:end w:val="single" w:space="0" w:color="D3D3D3"/>
+            </w:tcBorders>
+          </w:tcPr>
+          <w:p>
+            <w:pPr>
+              <w:spacing w:before="0" w:after="60"/>
+              <w:keepNext/>
+              <w:jc w:val="end"/>
+            </w:pPr>
+            <w:r>
+              <w:rPr>
+                <w:rFonts w:ascii="Calibri" w:hAnsi="Calibri"/>
+                <w:sz w:val="20"/>
+              </w:rPr>
+              <w:t xml:space="default">0.003</w:t>
+            </w:r>
+          </w:p>
+        </w:tc>
+        <w:tc>
+          <w:tcPr>
+            <w:tcBorders>
+              <w:top w:val="single" w:space="0" w:color="D3D3D3"/>
+              <w:bottom w:val="single" w:space="0" w:color="D3D3D3"/>
+              <w:start w:val="single" w:space="0" w:color="D3D3D3"/>
+              <w:end w:val="single" w:space="0" w:color="D3D3D3"/>
+            </w:tcBorders>
+          </w:tcPr>
+          <w:p>
+            <w:pPr>
+              <w:spacing w:before="0" w:after="60"/>
+              <w:keepNext/>
+              <w:jc w:val="end"/>
+            </w:pPr>
+            <w:r>
+              <w:rPr>
+                <w:rFonts w:ascii="Calibri" w:hAnsi="Calibri"/>
+                <w:sz w:val="20"/>
+              </w:rPr>
+              <w:t xml:space="default">0.14</w:t>
             </w:r>
           </w:p>
         </w:tc>
@@ -1395,79 +1386,79 @@
                 <w:rFonts w:ascii="Calibri" w:hAnsi="Calibri"/>
                 <w:sz w:val="20"/>
               </w:rPr>
-              <w:t xml:space="default">Clim_PC1_s</w:t>
-            </w:r>
-          </w:p>
-        </w:tc>
-        <w:tc>
-          <w:tcPr>
-            <w:tcBorders>
-              <w:top w:val="single" w:space="0" w:color="D3D3D3"/>
-              <w:bottom w:val="single" w:space="0" w:color="D3D3D3"/>
-              <w:start w:val="single" w:space="0" w:color="D3D3D3"/>
-              <w:end w:val="single" w:space="0" w:color="D3D3D3"/>
-            </w:tcBorders>
-          </w:tcPr>
-          <w:p>
-            <w:pPr>
-              <w:spacing w:before="0" w:after="60"/>
-              <w:keepNext/>
-              <w:jc w:val="end"/>
-            </w:pPr>
-            <w:r>
-              <w:rPr>
-                <w:rFonts w:ascii="Calibri" w:hAnsi="Calibri"/>
-                <w:sz w:val="20"/>
-              </w:rPr>
-              <w:t xml:space="default">0.102</w:t>
-            </w:r>
-          </w:p>
-        </w:tc>
-        <w:tc>
-          <w:tcPr>
-            <w:tcBorders>
-              <w:top w:val="single" w:space="0" w:color="D3D3D3"/>
-              <w:bottom w:val="single" w:space="0" w:color="D3D3D3"/>
-              <w:start w:val="single" w:space="0" w:color="D3D3D3"/>
-              <w:end w:val="single" w:space="0" w:color="D3D3D3"/>
-            </w:tcBorders>
-          </w:tcPr>
-          <w:p>
-            <w:pPr>
-              <w:spacing w:before="0" w:after="60"/>
-              <w:keepNext/>
-              <w:jc w:val="end"/>
-            </w:pPr>
-            <w:r>
-              <w:rPr>
-                <w:rFonts w:ascii="Calibri" w:hAnsi="Calibri"/>
-                <w:sz w:val="20"/>
-              </w:rPr>
-              <w:t xml:space="default">0.099</w:t>
-            </w:r>
-          </w:p>
-        </w:tc>
-        <w:tc>
-          <w:tcPr>
-            <w:tcBorders>
-              <w:top w:val="single" w:space="0" w:color="D3D3D3"/>
-              <w:bottom w:val="single" w:space="0" w:color="D3D3D3"/>
-              <w:start w:val="single" w:space="0" w:color="D3D3D3"/>
-              <w:end w:val="single" w:space="0" w:color="D3D3D3"/>
-            </w:tcBorders>
-          </w:tcPr>
-          <w:p>
-            <w:pPr>
-              <w:spacing w:before="0" w:after="60"/>
-              <w:keepNext/>
-              <w:jc w:val="end"/>
-            </w:pPr>
-            <w:r>
-              <w:rPr>
-                <w:rFonts w:ascii="Calibri" w:hAnsi="Calibri"/>
-                <w:sz w:val="20"/>
-              </w:rPr>
-              <w:t xml:space="default">0.305</w:t>
+              <w:t xml:space="default">ClimPC1_s</w:t>
+            </w:r>
+          </w:p>
+        </w:tc>
+        <w:tc>
+          <w:tcPr>
+            <w:tcBorders>
+              <w:top w:val="single" w:space="0" w:color="D3D3D3"/>
+              <w:bottom w:val="single" w:space="0" w:color="D3D3D3"/>
+              <w:start w:val="single" w:space="0" w:color="D3D3D3"/>
+              <w:end w:val="single" w:space="0" w:color="D3D3D3"/>
+            </w:tcBorders>
+          </w:tcPr>
+          <w:p>
+            <w:pPr>
+              <w:spacing w:before="0" w:after="60"/>
+              <w:keepNext/>
+              <w:jc w:val="end"/>
+            </w:pPr>
+            <w:r>
+              <w:rPr>
+                <w:rFonts w:ascii="Calibri" w:hAnsi="Calibri"/>
+                <w:sz w:val="20"/>
+              </w:rPr>
+              <w:t xml:space="default">-0.101</w:t>
+            </w:r>
+          </w:p>
+        </w:tc>
+        <w:tc>
+          <w:tcPr>
+            <w:tcBorders>
+              <w:top w:val="single" w:space="0" w:color="D3D3D3"/>
+              <w:bottom w:val="single" w:space="0" w:color="D3D3D3"/>
+              <w:start w:val="single" w:space="0" w:color="D3D3D3"/>
+              <w:end w:val="single" w:space="0" w:color="D3D3D3"/>
+            </w:tcBorders>
+          </w:tcPr>
+          <w:p>
+            <w:pPr>
+              <w:spacing w:before="0" w:after="60"/>
+              <w:keepNext/>
+              <w:jc w:val="end"/>
+            </w:pPr>
+            <w:r>
+              <w:rPr>
+                <w:rFonts w:ascii="Calibri" w:hAnsi="Calibri"/>
+                <w:sz w:val="20"/>
+              </w:rPr>
+              <w:t xml:space="default">0.104</w:t>
+            </w:r>
+          </w:p>
+        </w:tc>
+        <w:tc>
+          <w:tcPr>
+            <w:tcBorders>
+              <w:top w:val="single" w:space="0" w:color="D3D3D3"/>
+              <w:bottom w:val="single" w:space="0" w:color="D3D3D3"/>
+              <w:start w:val="single" w:space="0" w:color="D3D3D3"/>
+              <w:end w:val="single" w:space="0" w:color="D3D3D3"/>
+            </w:tcBorders>
+          </w:tcPr>
+          <w:p>
+            <w:pPr>
+              <w:spacing w:before="0" w:after="60"/>
+              <w:keepNext/>
+              <w:jc w:val="end"/>
+            </w:pPr>
+            <w:r>
+              <w:rPr>
+                <w:rFonts w:ascii="Calibri" w:hAnsi="Calibri"/>
+                <w:sz w:val="20"/>
+              </w:rPr>
+              <w:t xml:space="default">0.332</w:t>
             </w:r>
           </w:p>
         </w:tc>
@@ -1515,7 +1506,7 @@
                 <w:rFonts w:ascii="Calibri" w:hAnsi="Calibri"/>
                 <w:sz w:val="20"/>
               </w:rPr>
-              <w:t xml:space="default">0.70</w:t>
+              <w:t xml:space="default">0.58</w:t>
             </w:r>
           </w:p>
         </w:tc>
@@ -1544,79 +1535,79 @@
                 <w:rFonts w:ascii="Calibri" w:hAnsi="Calibri"/>
                 <w:sz w:val="20"/>
               </w:rPr>
-              <w:t xml:space="default">Clim_PC1_s2</w:t>
-            </w:r>
-          </w:p>
-        </w:tc>
-        <w:tc>
-          <w:tcPr>
-            <w:tcBorders>
-              <w:top w:val="single" w:space="0" w:color="D3D3D3"/>
-              <w:bottom w:val="single" w:space="0" w:color="D3D3D3"/>
-              <w:start w:val="single" w:space="0" w:color="D3D3D3"/>
-              <w:end w:val="single" w:space="0" w:color="D3D3D3"/>
-            </w:tcBorders>
-          </w:tcPr>
-          <w:p>
-            <w:pPr>
-              <w:spacing w:before="0" w:after="60"/>
-              <w:keepNext/>
-              <w:jc w:val="end"/>
-            </w:pPr>
-            <w:r>
-              <w:rPr>
-                <w:rFonts w:ascii="Calibri" w:hAnsi="Calibri"/>
-                <w:sz w:val="20"/>
-              </w:rPr>
-              <w:t xml:space="default">0.018</w:t>
-            </w:r>
-          </w:p>
-        </w:tc>
-        <w:tc>
-          <w:tcPr>
-            <w:tcBorders>
-              <w:top w:val="single" w:space="0" w:color="D3D3D3"/>
-              <w:bottom w:val="single" w:space="0" w:color="D3D3D3"/>
-              <w:start w:val="single" w:space="0" w:color="D3D3D3"/>
-              <w:end w:val="single" w:space="0" w:color="D3D3D3"/>
-            </w:tcBorders>
-          </w:tcPr>
-          <w:p>
-            <w:pPr>
-              <w:spacing w:before="0" w:after="60"/>
-              <w:keepNext/>
-              <w:jc w:val="end"/>
-            </w:pPr>
-            <w:r>
-              <w:rPr>
-                <w:rFonts w:ascii="Calibri" w:hAnsi="Calibri"/>
-                <w:sz w:val="20"/>
-              </w:rPr>
-              <w:t xml:space="default">0.108</w:t>
-            </w:r>
-          </w:p>
-        </w:tc>
-        <w:tc>
-          <w:tcPr>
-            <w:tcBorders>
-              <w:top w:val="single" w:space="0" w:color="D3D3D3"/>
-              <w:bottom w:val="single" w:space="0" w:color="D3D3D3"/>
-              <w:start w:val="single" w:space="0" w:color="D3D3D3"/>
-              <w:end w:val="single" w:space="0" w:color="D3D3D3"/>
-            </w:tcBorders>
-          </w:tcPr>
-          <w:p>
-            <w:pPr>
-              <w:spacing w:before="0" w:after="60"/>
-              <w:keepNext/>
-              <w:jc w:val="end"/>
-            </w:pPr>
-            <w:r>
-              <w:rPr>
-                <w:rFonts w:ascii="Calibri" w:hAnsi="Calibri"/>
-                <w:sz w:val="20"/>
-              </w:rPr>
-              <w:t xml:space="default">0.870</w:t>
+              <w:t xml:space="default">ClimPC1_s2</w:t>
+            </w:r>
+          </w:p>
+        </w:tc>
+        <w:tc>
+          <w:tcPr>
+            <w:tcBorders>
+              <w:top w:val="single" w:space="0" w:color="D3D3D3"/>
+              <w:bottom w:val="single" w:space="0" w:color="D3D3D3"/>
+              <w:start w:val="single" w:space="0" w:color="D3D3D3"/>
+              <w:end w:val="single" w:space="0" w:color="D3D3D3"/>
+            </w:tcBorders>
+          </w:tcPr>
+          <w:p>
+            <w:pPr>
+              <w:spacing w:before="0" w:after="60"/>
+              <w:keepNext/>
+              <w:jc w:val="end"/>
+            </w:pPr>
+            <w:r>
+              <w:rPr>
+                <w:rFonts w:ascii="Calibri" w:hAnsi="Calibri"/>
+                <w:sz w:val="20"/>
+              </w:rPr>
+              <w:t xml:space="default">0.069</w:t>
+            </w:r>
+          </w:p>
+        </w:tc>
+        <w:tc>
+          <w:tcPr>
+            <w:tcBorders>
+              <w:top w:val="single" w:space="0" w:color="D3D3D3"/>
+              <w:bottom w:val="single" w:space="0" w:color="D3D3D3"/>
+              <w:start w:val="single" w:space="0" w:color="D3D3D3"/>
+              <w:end w:val="single" w:space="0" w:color="D3D3D3"/>
+            </w:tcBorders>
+          </w:tcPr>
+          <w:p>
+            <w:pPr>
+              <w:spacing w:before="0" w:after="60"/>
+              <w:keepNext/>
+              <w:jc w:val="end"/>
+            </w:pPr>
+            <w:r>
+              <w:rPr>
+                <w:rFonts w:ascii="Calibri" w:hAnsi="Calibri"/>
+                <w:sz w:val="20"/>
+              </w:rPr>
+              <w:t xml:space="default">0.109</w:t>
+            </w:r>
+          </w:p>
+        </w:tc>
+        <w:tc>
+          <w:tcPr>
+            <w:tcBorders>
+              <w:top w:val="single" w:space="0" w:color="D3D3D3"/>
+              <w:bottom w:val="single" w:space="0" w:color="D3D3D3"/>
+              <w:start w:val="single" w:space="0" w:color="D3D3D3"/>
+              <w:end w:val="single" w:space="0" w:color="D3D3D3"/>
+            </w:tcBorders>
+          </w:tcPr>
+          <w:p>
+            <w:pPr>
+              <w:spacing w:before="0" w:after="60"/>
+              <w:keepNext/>
+              <w:jc w:val="end"/>
+            </w:pPr>
+            <w:r>
+              <w:rPr>
+                <w:rFonts w:ascii="Calibri" w:hAnsi="Calibri"/>
+                <w:sz w:val="20"/>
+              </w:rPr>
+              <w:t xml:space="default">0.527</w:t>
             </w:r>
           </w:p>
         </w:tc>
@@ -1664,7 +1655,7 @@
                 <w:rFonts w:ascii="Calibri" w:hAnsi="Calibri"/>
                 <w:sz w:val="20"/>
               </w:rPr>
-              <w:t xml:space="default">0.70</w:t>
+              <w:t xml:space="default">0.58</w:t>
             </w:r>
           </w:p>
         </w:tc>
@@ -1726,103 +1717,103 @@
                 <w:rFonts w:ascii="Calibri" w:hAnsi="Calibri"/>
                 <w:sz w:val="20"/>
               </w:rPr>
-              <w:t xml:space="default">Clim_PC1_s</w:t>
-            </w:r>
-          </w:p>
-        </w:tc>
-        <w:tc>
-          <w:tcPr>
-            <w:tcBorders>
-              <w:top w:val="single" w:space="0" w:color="D3D3D3"/>
-              <w:bottom w:val="single" w:space="0" w:color="D3D3D3"/>
-              <w:start w:val="single" w:space="0" w:color="D3D3D3"/>
-              <w:end w:val="single" w:space="0" w:color="D3D3D3"/>
-            </w:tcBorders>
-          </w:tcPr>
-          <w:p>
-            <w:pPr>
-              <w:spacing w:before="0" w:after="60"/>
-              <w:keepNext/>
-              <w:jc w:val="end"/>
-            </w:pPr>
-            <w:r>
-              <w:rPr>
-                <w:rFonts w:ascii="Calibri" w:hAnsi="Calibri"/>
-                <w:sz w:val="20"/>
-              </w:rPr>
-              <w:t xml:space="default">0.155</w:t>
-            </w:r>
-          </w:p>
-        </w:tc>
-        <w:tc>
-          <w:tcPr>
-            <w:tcBorders>
-              <w:top w:val="single" w:space="0" w:color="D3D3D3"/>
-              <w:bottom w:val="single" w:space="0" w:color="D3D3D3"/>
-              <w:start w:val="single" w:space="0" w:color="D3D3D3"/>
-              <w:end w:val="single" w:space="0" w:color="D3D3D3"/>
-            </w:tcBorders>
-          </w:tcPr>
-          <w:p>
-            <w:pPr>
-              <w:spacing w:before="0" w:after="60"/>
-              <w:keepNext/>
-              <w:jc w:val="end"/>
-            </w:pPr>
-            <w:r>
-              <w:rPr>
-                <w:rFonts w:ascii="Calibri" w:hAnsi="Calibri"/>
-                <w:sz w:val="20"/>
-              </w:rPr>
-              <w:t xml:space="default">0.09</w:t>
-            </w:r>
-          </w:p>
-        </w:tc>
-        <w:tc>
-          <w:tcPr>
-            <w:tcBorders>
-              <w:top w:val="single" w:space="0" w:color="D3D3D3"/>
-              <w:bottom w:val="single" w:space="0" w:color="D3D3D3"/>
-              <w:start w:val="single" w:space="0" w:color="D3D3D3"/>
-              <w:end w:val="single" w:space="0" w:color="D3D3D3"/>
-            </w:tcBorders>
-          </w:tcPr>
-          <w:p>
-            <w:pPr>
-              <w:spacing w:before="0" w:after="60"/>
-              <w:keepNext/>
-              <w:jc w:val="end"/>
-            </w:pPr>
-            <w:r>
-              <w:rPr>
-                <w:rFonts w:ascii="Calibri" w:hAnsi="Calibri"/>
-                <w:sz w:val="20"/>
-              </w:rPr>
-              <w:t xml:space="default">0.084</w:t>
-            </w:r>
-          </w:p>
-        </w:tc>
-        <w:tc>
-          <w:tcPr>
-            <w:tcBorders>
-              <w:top w:val="single" w:space="0" w:color="D3D3D3"/>
-              <w:bottom w:val="single" w:space="0" w:color="D3D3D3"/>
-              <w:start w:val="single" w:space="0" w:color="D3D3D3"/>
-              <w:end w:val="single" w:space="0" w:color="D3D3D3"/>
-            </w:tcBorders>
-          </w:tcPr>
-          <w:p>
-            <w:pPr>
-              <w:spacing w:before="0" w:after="60"/>
-              <w:keepNext/>
-              <w:jc w:val="end"/>
-            </w:pPr>
-            <w:r>
-              <w:rPr>
-                <w:rFonts w:ascii="Calibri" w:hAnsi="Calibri"/>
-                <w:sz w:val="20"/>
-              </w:rPr>
-              <w:t xml:space="default">0.02</w:t>
+              <w:t xml:space="default">ClimPC1_s</w:t>
+            </w:r>
+          </w:p>
+        </w:tc>
+        <w:tc>
+          <w:tcPr>
+            <w:tcBorders>
+              <w:top w:val="single" w:space="0" w:color="D3D3D3"/>
+              <w:bottom w:val="single" w:space="0" w:color="D3D3D3"/>
+              <w:start w:val="single" w:space="0" w:color="D3D3D3"/>
+              <w:end w:val="single" w:space="0" w:color="D3D3D3"/>
+            </w:tcBorders>
+          </w:tcPr>
+          <w:p>
+            <w:pPr>
+              <w:spacing w:before="0" w:after="60"/>
+              <w:keepNext/>
+              <w:jc w:val="end"/>
+            </w:pPr>
+            <w:r>
+              <w:rPr>
+                <w:rFonts w:ascii="Calibri" w:hAnsi="Calibri"/>
+                <w:sz w:val="20"/>
+              </w:rPr>
+              <w:t xml:space="default">-0.166</w:t>
+            </w:r>
+          </w:p>
+        </w:tc>
+        <w:tc>
+          <w:tcPr>
+            <w:tcBorders>
+              <w:top w:val="single" w:space="0" w:color="D3D3D3"/>
+              <w:bottom w:val="single" w:space="0" w:color="D3D3D3"/>
+              <w:start w:val="single" w:space="0" w:color="D3D3D3"/>
+              <w:end w:val="single" w:space="0" w:color="D3D3D3"/>
+            </w:tcBorders>
+          </w:tcPr>
+          <w:p>
+            <w:pPr>
+              <w:spacing w:before="0" w:after="60"/>
+              <w:keepNext/>
+              <w:jc w:val="end"/>
+            </w:pPr>
+            <w:r>
+              <w:rPr>
+                <w:rFonts w:ascii="Calibri" w:hAnsi="Calibri"/>
+                <w:sz w:val="20"/>
+              </w:rPr>
+              <w:t xml:space="default">0.092</w:t>
+            </w:r>
+          </w:p>
+        </w:tc>
+        <w:tc>
+          <w:tcPr>
+            <w:tcBorders>
+              <w:top w:val="single" w:space="0" w:color="D3D3D3"/>
+              <w:bottom w:val="single" w:space="0" w:color="D3D3D3"/>
+              <w:start w:val="single" w:space="0" w:color="D3D3D3"/>
+              <w:end w:val="single" w:space="0" w:color="D3D3D3"/>
+            </w:tcBorders>
+          </w:tcPr>
+          <w:p>
+            <w:pPr>
+              <w:spacing w:before="0" w:after="60"/>
+              <w:keepNext/>
+              <w:jc w:val="end"/>
+            </w:pPr>
+            <w:r>
+              <w:rPr>
+                <w:rFonts w:ascii="Calibri" w:hAnsi="Calibri"/>
+                <w:sz w:val="20"/>
+              </w:rPr>
+              <w:t xml:space="default">0.070</w:t>
+            </w:r>
+          </w:p>
+        </w:tc>
+        <w:tc>
+          <w:tcPr>
+            <w:tcBorders>
+              <w:top w:val="single" w:space="0" w:color="D3D3D3"/>
+              <w:bottom w:val="single" w:space="0" w:color="D3D3D3"/>
+              <w:start w:val="single" w:space="0" w:color="D3D3D3"/>
+              <w:end w:val="single" w:space="0" w:color="D3D3D3"/>
+            </w:tcBorders>
+          </w:tcPr>
+          <w:p>
+            <w:pPr>
+              <w:spacing w:before="0" w:after="60"/>
+              <w:keepNext/>
+              <w:jc w:val="end"/>
+            </w:pPr>
+            <w:r>
+              <w:rPr>
+                <w:rFonts w:ascii="Calibri" w:hAnsi="Calibri"/>
+                <w:sz w:val="20"/>
+              </w:rPr>
+              <w:t xml:space="default">0.03</w:t>
             </w:r>
           </w:p>
         </w:tc>
@@ -1875,103 +1866,103 @@
                 <w:rFonts w:ascii="Calibri" w:hAnsi="Calibri"/>
                 <w:sz w:val="20"/>
               </w:rPr>
-              <w:t xml:space="default">Clim_PC1_s2</w:t>
-            </w:r>
-          </w:p>
-        </w:tc>
-        <w:tc>
-          <w:tcPr>
-            <w:tcBorders>
-              <w:top w:val="single" w:space="0" w:color="D3D3D3"/>
-              <w:bottom w:val="single" w:space="0" w:color="D3D3D3"/>
-              <w:start w:val="single" w:space="0" w:color="D3D3D3"/>
-              <w:end w:val="single" w:space="0" w:color="D3D3D3"/>
-            </w:tcBorders>
-          </w:tcPr>
-          <w:p>
-            <w:pPr>
-              <w:spacing w:before="0" w:after="60"/>
-              <w:keepNext/>
-              <w:jc w:val="end"/>
-            </w:pPr>
-            <w:r>
-              <w:rPr>
-                <w:rFonts w:ascii="Calibri" w:hAnsi="Calibri"/>
-                <w:sz w:val="20"/>
-              </w:rPr>
-              <w:t xml:space="default">0.076</w:t>
-            </w:r>
-          </w:p>
-        </w:tc>
-        <w:tc>
-          <w:tcPr>
-            <w:tcBorders>
-              <w:top w:val="single" w:space="0" w:color="D3D3D3"/>
-              <w:bottom w:val="single" w:space="0" w:color="D3D3D3"/>
-              <w:start w:val="single" w:space="0" w:color="D3D3D3"/>
-              <w:end w:val="single" w:space="0" w:color="D3D3D3"/>
-            </w:tcBorders>
-          </w:tcPr>
-          <w:p>
-            <w:pPr>
-              <w:spacing w:before="0" w:after="60"/>
-              <w:keepNext/>
-              <w:jc w:val="end"/>
-            </w:pPr>
-            <w:r>
-              <w:rPr>
-                <w:rFonts w:ascii="Calibri" w:hAnsi="Calibri"/>
-                <w:sz w:val="20"/>
-              </w:rPr>
-              <w:t xml:space="default">0.098</w:t>
-            </w:r>
-          </w:p>
-        </w:tc>
-        <w:tc>
-          <w:tcPr>
-            <w:tcBorders>
-              <w:top w:val="single" w:space="0" w:color="D3D3D3"/>
-              <w:bottom w:val="single" w:space="0" w:color="D3D3D3"/>
-              <w:start w:val="single" w:space="0" w:color="D3D3D3"/>
-              <w:end w:val="single" w:space="0" w:color="D3D3D3"/>
-            </w:tcBorders>
-          </w:tcPr>
-          <w:p>
-            <w:pPr>
-              <w:spacing w:before="0" w:after="60"/>
-              <w:keepNext/>
-              <w:jc w:val="end"/>
-            </w:pPr>
-            <w:r>
-              <w:rPr>
-                <w:rFonts w:ascii="Calibri" w:hAnsi="Calibri"/>
-                <w:sz w:val="20"/>
-              </w:rPr>
-              <w:t xml:space="default">0.434</w:t>
-            </w:r>
-          </w:p>
-        </w:tc>
-        <w:tc>
-          <w:tcPr>
-            <w:tcBorders>
-              <w:top w:val="single" w:space="0" w:color="D3D3D3"/>
-              <w:bottom w:val="single" w:space="0" w:color="D3D3D3"/>
-              <w:start w:val="single" w:space="0" w:color="D3D3D3"/>
-              <w:end w:val="single" w:space="0" w:color="D3D3D3"/>
-            </w:tcBorders>
-          </w:tcPr>
-          <w:p>
-            <w:pPr>
-              <w:spacing w:before="0" w:after="60"/>
-              <w:keepNext/>
-              <w:jc w:val="end"/>
-            </w:pPr>
-            <w:r>
-              <w:rPr>
-                <w:rFonts w:ascii="Calibri" w:hAnsi="Calibri"/>
-                <w:sz w:val="20"/>
-              </w:rPr>
-              <w:t xml:space="default">0.02</w:t>
+              <w:t xml:space="default">ClimPC1_s2</w:t>
+            </w:r>
+          </w:p>
+        </w:tc>
+        <w:tc>
+          <w:tcPr>
+            <w:tcBorders>
+              <w:top w:val="single" w:space="0" w:color="D3D3D3"/>
+              <w:bottom w:val="single" w:space="0" w:color="D3D3D3"/>
+              <w:start w:val="single" w:space="0" w:color="D3D3D3"/>
+              <w:end w:val="single" w:space="0" w:color="D3D3D3"/>
+            </w:tcBorders>
+          </w:tcPr>
+          <w:p>
+            <w:pPr>
+              <w:spacing w:before="0" w:after="60"/>
+              <w:keepNext/>
+              <w:jc w:val="end"/>
+            </w:pPr>
+            <w:r>
+              <w:rPr>
+                <w:rFonts w:ascii="Calibri" w:hAnsi="Calibri"/>
+                <w:sz w:val="20"/>
+              </w:rPr>
+              <w:t xml:space="default">0.065</w:t>
+            </w:r>
+          </w:p>
+        </w:tc>
+        <w:tc>
+          <w:tcPr>
+            <w:tcBorders>
+              <w:top w:val="single" w:space="0" w:color="D3D3D3"/>
+              <w:bottom w:val="single" w:space="0" w:color="D3D3D3"/>
+              <w:start w:val="single" w:space="0" w:color="D3D3D3"/>
+              <w:end w:val="single" w:space="0" w:color="D3D3D3"/>
+            </w:tcBorders>
+          </w:tcPr>
+          <w:p>
+            <w:pPr>
+              <w:spacing w:before="0" w:after="60"/>
+              <w:keepNext/>
+              <w:jc w:val="end"/>
+            </w:pPr>
+            <w:r>
+              <w:rPr>
+                <w:rFonts w:ascii="Calibri" w:hAnsi="Calibri"/>
+                <w:sz w:val="20"/>
+              </w:rPr>
+              <w:t xml:space="default">0.097</w:t>
+            </w:r>
+          </w:p>
+        </w:tc>
+        <w:tc>
+          <w:tcPr>
+            <w:tcBorders>
+              <w:top w:val="single" w:space="0" w:color="D3D3D3"/>
+              <w:bottom w:val="single" w:space="0" w:color="D3D3D3"/>
+              <w:start w:val="single" w:space="0" w:color="D3D3D3"/>
+              <w:end w:val="single" w:space="0" w:color="D3D3D3"/>
+            </w:tcBorders>
+          </w:tcPr>
+          <w:p>
+            <w:pPr>
+              <w:spacing w:before="0" w:after="60"/>
+              <w:keepNext/>
+              <w:jc w:val="end"/>
+            </w:pPr>
+            <w:r>
+              <w:rPr>
+                <w:rFonts w:ascii="Calibri" w:hAnsi="Calibri"/>
+                <w:sz w:val="20"/>
+              </w:rPr>
+              <w:t xml:space="default">0.502</w:t>
+            </w:r>
+          </w:p>
+        </w:tc>
+        <w:tc>
+          <w:tcPr>
+            <w:tcBorders>
+              <w:top w:val="single" w:space="0" w:color="D3D3D3"/>
+              <w:bottom w:val="single" w:space="0" w:color="D3D3D3"/>
+              <w:start w:val="single" w:space="0" w:color="D3D3D3"/>
+              <w:end w:val="single" w:space="0" w:color="D3D3D3"/>
+            </w:tcBorders>
+          </w:tcPr>
+          <w:p>
+            <w:pPr>
+              <w:spacing w:before="0" w:after="60"/>
+              <w:keepNext/>
+              <w:jc w:val="end"/>
+            </w:pPr>
+            <w:r>
+              <w:rPr>
+                <w:rFonts w:ascii="Calibri" w:hAnsi="Calibri"/>
+                <w:sz w:val="20"/>
+              </w:rPr>
+              <w:t xml:space="default">0.03</w:t>
             </w:r>
           </w:p>
         </w:tc>
@@ -2081,7 +2072,7 @@
                 <w:rFonts w:ascii="Calibri" w:hAnsi="Calibri"/>
                 <w:sz w:val="20"/>
               </w:rPr>
-              <w:t xml:space="default">-0.317</w:t>
+              <w:t xml:space="default">-0.243</w:t>
             </w:r>
           </w:p>
         </w:tc>
@@ -2178,220 +2169,6 @@
                 <w:sz w:val="20"/>
               </w:rPr>
               <w:t xml:space="default">NA</w:t>
-            </w:r>
-          </w:p>
-        </w:tc>
-      </w:tr>
-      <w:tr>
-        <w:trPr>
-          <w:cantSplit/>
-        </w:trPr>
-        <w:tc>
-          <w:tcPr>
-            <w:tcBorders>
-              <w:top w:val="single" w:sz="16" w:space="0" w:color="D3D3D3"/>
-              <w:bottom w:val="single" w:sz="16" w:space="0" w:color="D3D3D3"/>
-              <w:start w:val="single" w:space="0" w:color="D3D3D3"/>
-              <w:end w:val="single" w:space="0" w:color="D3D3D3"/>
-            </w:tcBorders>
-            <w:tcMar>
-              <w:top w:w="25" w:type="dxa"/>
-            </w:tcMar>
-            <w:gridSpan w:val="6"/>
-          </w:tcPr>
-          <w:p>
-            <w:pPr>
-              <w:spacing w:before="0" w:after="60"/>
-              <w:keepNext/>
-            </w:pPr>
-            <w:r>
-              <w:rPr>
-                <w:rFonts w:ascii="Calibri" w:hAnsi="Calibri"/>
-                <w:sz w:val="20"/>
-                <w:b w:val="true"/>
-              </w:rPr>
-              <w:t xml:space="default">~~Conc_s</w:t>
-            </w:r>
-          </w:p>
-        </w:tc>
-      </w:tr>
-      <w:tr>
-        <w:trPr>
-          <w:cantSplit/>
-        </w:trPr>
-        <w:tc>
-          <w:tcPr>
-            <w:tcBorders>
-              <w:top w:val="single" w:space="0" w:color="D3D3D3"/>
-              <w:bottom w:val="single" w:space="0" w:color="D3D3D3"/>
-              <w:start w:val="single" w:space="0" w:color="D3D3D3"/>
-              <w:end w:val="single" w:space="0" w:color="D3D3D3"/>
-            </w:tcBorders>
-          </w:tcPr>
-          <w:p>
-            <w:pPr>
-              <w:spacing w:before="0" w:after="60"/>
-              <w:keepNext/>
-              <w:jc w:val="start"/>
-            </w:pPr>
-            <w:r>
-              <w:rPr>
-                <w:rFonts w:ascii="Calibri" w:hAnsi="Calibri"/>
-                <w:sz w:val="20"/>
-              </w:rPr>
-              <w:t xml:space="default">~~SLA_s</w:t>
-            </w:r>
-          </w:p>
-        </w:tc>
-        <w:tc>
-          <w:tcPr>
-            <w:tcBorders>
-              <w:top w:val="single" w:space="0" w:color="D3D3D3"/>
-              <w:bottom w:val="single" w:space="0" w:color="D3D3D3"/>
-              <w:start w:val="single" w:space="0" w:color="D3D3D3"/>
-              <w:end w:val="single" w:space="0" w:color="D3D3D3"/>
-            </w:tcBorders>
-          </w:tcPr>
-          <w:p>
-            <w:pPr>
-              <w:spacing w:before="0" w:after="60"/>
-              <w:keepNext/>
-              <w:jc w:val="end"/>
-            </w:pPr>
-            <w:r>
-              <w:rPr>
-                <w:rFonts w:ascii="Calibri" w:hAnsi="Calibri"/>
-                <w:sz w:val="20"/>
-              </w:rPr>
-              <w:t xml:space="default">0.117</w:t>
-            </w:r>
-          </w:p>
-        </w:tc>
-        <w:tc>
-          <w:tcPr>
-            <w:tcBorders>
-              <w:top w:val="single" w:space="0" w:color="D3D3D3"/>
-              <w:bottom w:val="single" w:space="0" w:color="D3D3D3"/>
-              <w:start w:val="single" w:space="0" w:color="D3D3D3"/>
-              <w:end w:val="single" w:space="0" w:color="D3D3D3"/>
-            </w:tcBorders>
-          </w:tcPr>
-          <w:p>
-            <w:pPr>
-              <w:spacing w:before="0" w:after="60"/>
-              <w:keepNext/>
-              <w:jc w:val="end"/>
-            </w:pPr>
-            <w:r>
-              <w:rPr>
-                <w:rFonts w:ascii="Calibri" w:hAnsi="Calibri"/>
-                <w:sz w:val="20"/>
-              </w:rPr>
-              <w:t xml:space="default">-</w:t>
-            </w:r>
-          </w:p>
-        </w:tc>
-        <w:tc>
-          <w:tcPr>
-            <w:tcBorders>
-              <w:top w:val="single" w:space="0" w:color="D3D3D3"/>
-              <w:bottom w:val="single" w:space="0" w:color="D3D3D3"/>
-              <w:start w:val="single" w:space="0" w:color="D3D3D3"/>
-              <w:end w:val="single" w:space="0" w:color="D3D3D3"/>
-            </w:tcBorders>
-          </w:tcPr>
-          <w:p>
-            <w:pPr>
-              <w:spacing w:before="0" w:after="60"/>
-              <w:keepNext/>
-              <w:jc w:val="end"/>
-            </w:pPr>
-            <w:r>
-              <w:rPr>
-                <w:rFonts w:ascii="Calibri" w:hAnsi="Calibri"/>
-                <w:sz w:val="20"/>
-              </w:rPr>
-              <w:t xml:space="default">0.004</w:t>
-            </w:r>
-          </w:p>
-        </w:tc>
-        <w:tc>
-          <w:tcPr>
-            <w:tcBorders>
-              <w:top w:val="single" w:space="0" w:color="D3D3D3"/>
-              <w:bottom w:val="single" w:space="0" w:color="D3D3D3"/>
-              <w:start w:val="single" w:space="0" w:color="D3D3D3"/>
-              <w:end w:val="single" w:space="0" w:color="D3D3D3"/>
-            </w:tcBorders>
-          </w:tcPr>
-          <w:p>
-            <w:pPr>
-              <w:spacing w:before="0" w:after="60"/>
-              <w:keepNext/>
-              <w:jc w:val="end"/>
-            </w:pPr>
-            <w:r>
-              <w:rPr>
-                <w:rFonts w:ascii="Calibri" w:hAnsi="Calibri"/>
-                <w:sz w:val="20"/>
-              </w:rPr>
-              <w:t xml:space="default">NA</w:t>
-            </w:r>
-          </w:p>
-        </w:tc>
-        <w:tc>
-          <w:tcPr>
-            <w:tcBorders>
-              <w:top w:val="single" w:space="0" w:color="D3D3D3"/>
-              <w:bottom w:val="single" w:space="0" w:color="D3D3D3"/>
-              <w:start w:val="single" w:space="0" w:color="D3D3D3"/>
-              <w:end w:val="single" w:space="0" w:color="D3D3D3"/>
-            </w:tcBorders>
-          </w:tcPr>
-          <w:p>
-            <w:pPr>
-              <w:spacing w:before="0" w:after="60"/>
-              <w:keepNext/>
-              <w:jc w:val="end"/>
-            </w:pPr>
-            <w:r>
-              <w:rPr>
-                <w:rFonts w:ascii="Calibri" w:hAnsi="Calibri"/>
-                <w:sz w:val="20"/>
-              </w:rPr>
-              <w:t xml:space="default">NA</w:t>
-            </w:r>
-          </w:p>
-        </w:tc>
-      </w:tr>
-      <w:tr>
-        <w:trPr>
-          <w:cantSplit/>
-        </w:trPr>
-        <w:tc>
-          <w:tcPr>
-            <w:gridSpan w:val="6"/>
-          </w:tcPr>
-          <w:p>
-            <w:pPr>
-              <w:spacing w:before="0" w:after="60"/>
-              <w:keepNext/>
-            </w:pPr>
-            <w:r>
-              <w:rPr>
-                <w:vertAlign w:val="superscript"/>
-                <w:i/>
-                <w:rFonts w:ascii="Calibri" w:hAnsi="Calibri"/>
-                <w:sz w:val="20"/>
-              </w:rPr>
-              <w:t xml:space="default">1</w:t>
-            </w:r>
-            <w:r>
-              <w:rPr>
-                <w:rFonts w:ascii="Calibri" w:hAnsi="Calibri"/>
-                <w:sz w:val="20"/>
-              </w:rPr>
-              <w:t xml:space="default">R²m = marginal R-squared (fixed effects); R²c = conditional R-squared (full model).</w:t>
             </w:r>
           </w:p>
         </w:tc>
@@ -2523,10 +2300,10 @@
   <w:docDefaults>
     <w:rPrDefault>
       <w:rPr>
-        <w:rFonts w:asciiTheme="minorHAnsi" w:cstheme="minorBidi" w:eastAsiaTheme="minorHAnsi" w:hAnsiTheme="minorHAnsi"/>
+        <w:rFonts w:asciiTheme="minorHAnsi" w:cstheme="minorBidi" w:eastAsiaTheme="minorEastAsia" w:hAnsiTheme="minorHAnsi"/>
         <w:sz w:val="24"/>
         <w:szCs w:val="24"/>
-        <w:lang w:bidi="ar-SA" w:eastAsia="en-US" w:val="en-US"/>
+        <w:lang w:bidi="ar-SA" w:eastAsia="zh-CN" w:val="en-US"/>
       </w:rPr>
     </w:rPrDefault>
     <w:pPrDefault>
@@ -3067,13 +2844,6 @@
       </w:tblCellMar>
     </w:tblPr>
     <w:tblStylePr w:type="firstRow">
-      <w:tblPr>
-        <w:jc w:val="left"/>
-        <w:tblInd w:type="dxa" w:w="0"/>
-      </w:tblPr>
-      <w:trPr>
-        <w:jc w:val="left"/>
-      </w:trPr>
       <w:tcPr>
         <w:tcBorders>
           <w:bottom w:val="single"/>

</xml_diff>